<commit_message>
changed other_party_enter_email is False in inline condition in truefiling_serve_content.docx to not other_party_enter_email
</commit_message>
<xml_diff>
--- a/docassemble/AKA2JBranding/data/templates/truefiling_serve_content.docx
+++ b/docassemble/AKA2JBranding/data/templates/truefiling_serve_content.docx
@@ -1018,7 +1018,13 @@
         <w:pStyle w:val="Body"/>
       </w:pPr>
       <w:r>
-        <w:t>{{ "Because" if other_party_enter_email is False else "If" }</w:t>
+        <w:t xml:space="preserve">{{ "Because" if </w:t>
+      </w:r>
+      <w:r>
+        <w:t xml:space="preserve">not </w:t>
+      </w:r>
+      <w:r>
+        <w:t>other_party_enter_email else "If" }</w:t>
       </w:r>
       <w:r>
         <w:t>}</w:t>
@@ -4783,6 +4789,7 @@
   <w:style w:type="character" w:default="1" w:styleId="DefaultParagraphFont">
     <w:name w:val="Default Paragraph Font"/>
     <w:uiPriority w:val="1"/>
+    <w:semiHidden/>
     <w:unhideWhenUsed/>
   </w:style>
   <w:style w:type="table" w:default="1" w:styleId="TableNormal">

</xml_diff>